<commit_message>
Add architectural diagrams and implement Strategy pattern for Dolar quotes
- Created robustness diagrams for dashboard and transaction processes.
- Developed sequence diagrams for transaction registration.
- Added package and component diagrams to illustrate system architecture.
- Introduced class and entity-relationship diagrams for data modeling.
- Implemented deployment diagram for serverless architecture on Vercel.
- Applied Strategy pattern for fetching Dolar quotes with multiple providers (CriptoYa, DolarApi, and DB cache).
- Refactored CotizacionesService to utilize the new Strategy pattern for improved error handling and fallback mechanisms.
- Added PNG versions of all diagrams for documentation purposes.
</commit_message>
<xml_diff>
--- a/Zarix TIF v2.docx
+++ b/Zarix TIF v2.docx
@@ -25044,7 +25044,7 @@
         <w:rPr/>
         <w:drawing>
           <wp:inline distB="0" distT="0" distL="0" distR="0">
-            <wp:extent cx="5700000" cy="3649640"/>
+            <wp:extent cx="5700000" cy="6766845"/>
             <wp:effectExtent b="0" l="0" r="0" t="0"/>
             <wp:docPr id="1" name="image3.png"/>
             <a:graphic>
@@ -25064,7 +25064,7 @@
                   <pic:spPr>
                     <a:xfrm>
                       <a:off x="0" y="0"/>
-                      <a:ext cx="5700000" cy="3649640"/>
+                      <a:ext cx="5700000" cy="6766845"/>
                     </a:xfrm>
                     <a:prstGeom prst="rect"/>
                     <a:ln/>
@@ -32564,7 +32564,7 @@
         <w:rPr/>
         <w:drawing>
           <wp:inline distB="0" distT="0" distL="0" distR="0">
-            <wp:extent cx="5700000" cy="4059712"/>
+            <wp:extent cx="5700000" cy="7389164"/>
             <wp:effectExtent b="0" l="0" r="0" t="0"/>
             <wp:docPr id="3" name="image9.png"/>
             <a:graphic>
@@ -32584,7 +32584,7 @@
                   <pic:spPr>
                     <a:xfrm>
                       <a:off x="0" y="0"/>
-                      <a:ext cx="5700000" cy="4059712"/>
+                      <a:ext cx="5700000" cy="7389164"/>
                     </a:xfrm>
                     <a:prstGeom prst="rect"/>
                     <a:ln/>
@@ -33010,7 +33010,7 @@
         <w:rPr/>
         <w:drawing>
           <wp:inline distB="0" distT="0" distL="0" distR="0">
-            <wp:extent cx="5700000" cy="3649640"/>
+            <wp:extent cx="5700000" cy="2508551"/>
             <wp:effectExtent b="0" l="0" r="0" t="0"/>
             <wp:docPr id="2" name="image6.png"/>
             <a:graphic>
@@ -33030,7 +33030,7 @@
                   <pic:spPr>
                     <a:xfrm>
                       <a:off x="0" y="0"/>
-                      <a:ext cx="5700000" cy="3649640"/>
+                      <a:ext cx="5700000" cy="2508551"/>
                     </a:xfrm>
                     <a:prstGeom prst="rect"/>
                     <a:ln/>
@@ -33427,7 +33427,7 @@
         <w:rPr/>
         <w:drawing>
           <wp:inline distB="0" distT="0" distL="0" distR="0">
-            <wp:extent cx="5700000" cy="3649640"/>
+            <wp:extent cx="5700000" cy="2241420"/>
             <wp:effectExtent b="0" l="0" r="0" t="0"/>
             <wp:docPr id="5" name="image10.png"/>
             <a:graphic>
@@ -33447,7 +33447,7 @@
                   <pic:spPr>
                     <a:xfrm>
                       <a:off x="0" y="0"/>
-                      <a:ext cx="5700000" cy="3649640"/>
+                      <a:ext cx="5700000" cy="2241420"/>
                     </a:xfrm>
                     <a:prstGeom prst="rect"/>
                     <a:ln/>
@@ -35172,7 +35172,7 @@
         <w:rPr/>
         <w:drawing>
           <wp:inline distB="0" distT="0" distL="0" distR="0">
-            <wp:extent cx="5700000" cy="3549056"/>
+            <wp:extent cx="5700000" cy="2717376"/>
             <wp:effectExtent b="0" l="0" r="0" t="0"/>
             <wp:docPr id="4" name="image4.png"/>
             <a:graphic>
@@ -35192,7 +35192,7 @@
                   <pic:spPr>
                     <a:xfrm>
                       <a:off x="0" y="0"/>
-                      <a:ext cx="5700000" cy="3549056"/>
+                      <a:ext cx="5700000" cy="2717376"/>
                     </a:xfrm>
                     <a:prstGeom prst="rect"/>
                     <a:ln/>
@@ -36399,7 +36399,7 @@
         <w:rPr/>
         <w:drawing>
           <wp:inline distB="0" distT="0" distL="0" distR="0">
-            <wp:extent cx="5700000" cy="4374418"/>
+            <wp:extent cx="5700000" cy="4239877"/>
             <wp:effectExtent b="0" l="0" r="0" t="0"/>
             <wp:docPr id="7" name="image7.png"/>
             <a:graphic>
@@ -36419,7 +36419,7 @@
                   <pic:spPr>
                     <a:xfrm>
                       <a:off x="0" y="0"/>
-                      <a:ext cx="5700000" cy="4374418"/>
+                      <a:ext cx="5700000" cy="4239877"/>
                     </a:xfrm>
                     <a:prstGeom prst="rect"/>
                     <a:ln/>
@@ -38076,7 +38076,7 @@
         <w:rPr/>
         <w:drawing>
           <wp:inline distB="0" distT="0" distL="0" distR="0">
-            <wp:extent cx="5700000" cy="4059712"/>
+            <wp:extent cx="5700000" cy="2842220"/>
             <wp:effectExtent b="0" l="0" r="0" t="0"/>
             <wp:docPr id="6" name="image2.png"/>
             <a:graphic>
@@ -38096,7 +38096,7 @@
                   <pic:spPr>
                     <a:xfrm>
                       <a:off x="0" y="0"/>
-                      <a:ext cx="5700000" cy="4059712"/>
+                      <a:ext cx="5700000" cy="2842220"/>
                     </a:xfrm>
                     <a:prstGeom prst="rect"/>
                     <a:ln/>
@@ -39136,7 +39136,7 @@
         <w:rPr/>
         <w:drawing>
           <wp:inline distB="0" distT="0" distL="0" distR="0">
-            <wp:extent cx="5700000" cy="3907547"/>
+            <wp:extent cx="5700000" cy="3265870"/>
             <wp:effectExtent b="0" l="0" r="0" t="0"/>
             <wp:docPr id="9" name="image1.png"/>
             <a:graphic>
@@ -39156,7 +39156,7 @@
                   <pic:spPr>
                     <a:xfrm>
                       <a:off x="0" y="0"/>
-                      <a:ext cx="5700000" cy="3907547"/>
+                      <a:ext cx="5700000" cy="3265870"/>
                     </a:xfrm>
                     <a:prstGeom prst="rect"/>
                     <a:ln/>
@@ -40592,7 +40592,7 @@
         <w:rPr/>
         <w:drawing>
           <wp:inline distB="0" distT="0" distL="0" distR="0">
-            <wp:extent cx="5700000" cy="3907547"/>
+            <wp:extent cx="5700000" cy="4241732"/>
             <wp:effectExtent b="0" l="0" r="0" t="0"/>
             <wp:docPr id="8" name="image5.png"/>
             <a:graphic>
@@ -40612,7 +40612,7 @@
                   <pic:spPr>
                     <a:xfrm>
                       <a:off x="0" y="0"/>
-                      <a:ext cx="5700000" cy="3907547"/>
+                      <a:ext cx="5700000" cy="4241732"/>
                     </a:xfrm>
                     <a:prstGeom prst="rect"/>
                     <a:ln/>
@@ -41687,7 +41687,7 @@
         <w:rPr/>
         <w:drawing>
           <wp:inline distB="0" distT="0" distL="0" distR="0">
-            <wp:extent cx="5700000" cy="3787248"/>
+            <wp:extent cx="5700000" cy="3367181"/>
             <wp:effectExtent b="0" l="0" r="0" t="0"/>
             <wp:docPr id="10" name="image8.png"/>
             <a:graphic>
@@ -41707,7 +41707,7 @@
                   <pic:spPr>
                     <a:xfrm>
                       <a:off x="0" y="0"/>
-                      <a:ext cx="5700000" cy="3787248"/>
+                      <a:ext cx="5700000" cy="3367181"/>
                     </a:xfrm>
                     <a:prstGeom prst="rect"/>
                     <a:ln/>
@@ -48439,6 +48439,329 @@
         <w:rPr>
           <w:rtl w:val="0"/>
         </w:rPr>
+      </w:r>
+    </w:p>
+    <w:p>
+      <w:pPr>
+        <w:pStyle w:val="Heading1"/>
+      </w:pPr>
+      <w:r>
+        <w:t>D. Anexo Técnico: Patrón de Diseño y Estilos Arquitectónicos</w:t>
+      </w:r>
+    </w:p>
+    <w:p>
+      <w:pPr/>
+      <w:r>
+        <w:t>Este anexo documenta, siguiendo la metodología ICONIX y los estándares de la materia, el patrón de diseño GoF aplicado al código real de Zarix y los estilos arquitectónicos identificados en su arquitectura. Ambos artefactos se derivan por ingeniería del código fuente del proyecto (Next.js 14 + Supabase), no de un diseño teórico.</w:t>
+      </w:r>
+    </w:p>
+    <w:p>
+      <w:pPr>
+        <w:pStyle w:val="Heading2"/>
+      </w:pPr>
+      <w:r>
+        <w:t>D.1 Patrón Aplicado: Strategy (Obtención de Cotizaciones Multi-Fuente)</w:t>
+      </w:r>
+    </w:p>
+    <w:p>
+      <w:pPr/>
+      <w:r>
+        <w:t>La cotización del dólar es un dato crítico de Zarix: alimenta el cálculo de patrimonio, la conversión de movimientos y el dashboard. Obtenerla es frágil porque depende de APIs externas que pueden fallar, demorar o devolver datos degradados (por ejemplo, el dólar blue en 0). Por eso el servicio resuelve la cotización con una cadena de fuentes y fallback: CriptoYa (fuente primaria) → DolarApi (respaldo HTTP) → último valor persistido en la base de datos.</w:t>
+      </w:r>
+    </w:p>
+    <w:p>
+      <w:pPr/>
+      <w:r>
+        <w:t>Esa lógica se encapsuló aplicando el patrón Strategy (Gamma et al., 2003): cada fuente de datos se modela como una estrategia intercambiable que cumple una interfaz común (DolarRateProvider), y el servicio (Context) recorre las estrategias en orden hasta obtener una cotización válida. El refactor reemplaza un bloque de try/catch anidados por una colección ordenada de proveedores, cumpliendo el principio Open/Closed: agregar una fuente nueva es implementar la interfaz y sumarla al arreglo, sin tocar el código que la consume.</w:t>
+      </w:r>
+    </w:p>
+    <w:p>
+      <w:pPr/>
+      <w:r>
+        <w:t>Documentación del patrón (estándar FCEIA-UNR para documentación de patrones de diseño, Cristia 2015):</w:t>
+      </w:r>
+    </w:p>
+    <w:p>
+      <w:pPr/>
+      <w:r>
+        <w:rPr>
+          <w:rFonts w:ascii="Consolas" w:hAnsi="Consolas"/>
+          <w:sz w:val="17"/>
+        </w:rPr>
+        <w:t>Pattern ObtencionDeCotizaciones based on Strategy because</w:t>
+        <w:br/>
+        <w:br/>
+        <w:t>Cambios previstos: i) la cotizacion del dolar puede obtenerse de varias</w:t>
+        <w:br/>
+        <w:t>fuentes (CriptoYa, DolarApi, cache en base de datos); ii) si una fuente</w:t>
+        <w:br/>
+        <w:t>falla o devuelve datos invalidos (ej. blue en 0), el sistema debe intentar</w:t>
+        <w:br/>
+        <w:t>con la siguiente sin acoplar al cliente a una fuente concreta; iii) debe</w:t>
+        <w:br/>
+        <w:t>poder agregarse una nueva fuente sin modificar el codigo que la consume;</w:t>
+        <w:br/>
+        <w:t>iv) el orden de preferencia/fallback debe ser explicito y configurable.</w:t>
+        <w:br/>
+        <w:br/>
+        <w:t>where</w:t>
+        <w:br/>
+        <w:t xml:space="preserve">    Strategy            is DolarRateProvider (interfaz con fetch())</w:t>
+        <w:br/>
+        <w:t xml:space="preserve">    Context             is CotizacionesService (mantiene la lista de proveedores)</w:t>
+        <w:br/>
+        <w:t xml:space="preserve">    ConcreteStrategy    is CriptoYaProvider (fuente primaria)</w:t>
+        <w:br/>
+        <w:t xml:space="preserve">    ConcreteStrategy    is DolarApiProvider (fallback HTTP)</w:t>
+        <w:br/>
+        <w:t xml:space="preserve">    ConcreteStrategy    is DbCacheProvider (ultimo valor persistido en exchange_rates)</w:t>
+        <w:br/>
+        <w:t xml:space="preserve">    algorithm()         is fetch(): Promise&lt;Record&lt;string, DolarQuote&gt;&gt;</w:t>
+        <w:br/>
+        <w:t xml:space="preserve">    contextInterface()  is getDolarQuotes() (recorre las estrategias en orden)</w:t>
+        <w:br/>
+        <w:br/>
+        <w:t>comments</w:t>
+        <w:br/>
+        <w:t>La interfaz DolarRateProvider define el contrato fetch() que toda fuente</w:t>
+        <w:br/>
+        <w:t>de cotizacion debe cumplir. CotizacionesService (Context) mantiene un</w:t>
+        <w:br/>
+        <w:t>arreglo ordenado de proveedores y los recorre hasta que uno devuelve una</w:t>
+        <w:br/>
+        <w:t>cotizacion valida, cacheando el resultado (TTL 300s) y persistiendolo en</w:t>
+        <w:br/>
+        <w:t>la tabla exchange_rates cuando proviene de una fuente en vivo. Agregar una</w:t>
+        <w:br/>
+        <w:t>fuente nueva = implementar DolarRateProvider y sumarla al arreglo</w:t>
+        <w:br/>
+        <w:t>(principio Open/Closed). El patron tambien exhibe rasgos de Chain of</w:t>
+        <w:br/>
+        <w:t>Responsibility por su semantica de fallback ordenado.</w:t>
+      </w:r>
+    </w:p>
+    <w:p>
+      <w:pPr>
+        <w:jc w:val="center"/>
+      </w:pPr>
+      <w:r>
+        <w:drawing>
+          <wp:inline>
+            <wp:extent cx="5696712" cy="4852049"/>
+            <wp:docPr id="11" name="Picture 11"/>
+            <wp:cNvGraphicFramePr>
+              <a:graphicFrameLocks noChangeAspect="1"/>
+            </wp:cNvGraphicFramePr>
+            <a:graphic>
+              <a:graphicData uri="http://schemas.openxmlformats.org/drawingml/2006/picture">
+                <pic:pic>
+                  <pic:nvPicPr>
+                    <pic:cNvPr id="0" name="fig11_patron_strategy.png"/>
+                    <pic:cNvPicPr/>
+                  </pic:nvPicPr>
+                  <pic:blipFill>
+                    <a:blip r:embed="rId18"/>
+                    <a:stretch>
+                      <a:fillRect/>
+                    </a:stretch>
+                  </pic:blipFill>
+                  <pic:spPr>
+                    <a:xfrm>
+                      <a:off x="0" y="0"/>
+                      <a:ext cx="5696712" cy="4852049"/>
+                    </a:xfrm>
+                    <a:prstGeom prst="rect"/>
+                  </pic:spPr>
+                </pic:pic>
+              </a:graphicData>
+            </a:graphic>
+          </wp:inline>
+        </w:drawing>
+      </w:r>
+    </w:p>
+    <w:p>
+      <w:pPr>
+        <w:jc w:val="center"/>
+      </w:pPr>
+      <w:r>
+        <w:rPr>
+          <w:i/>
+          <w:sz w:val="18"/>
+        </w:rPr>
+        <w:t>Figura 11 – Patrón Strategy aplicado a la obtención de cotizaciones (GoF + implementación en Zarix).</w:t>
+      </w:r>
+    </w:p>
+    <w:p>
+      <w:pPr/>
+      <w:r>
+        <w:t>Implementación: lib/services/cotizaciones.ts. Participantes: la interfaz DolarRateProvider; las estrategias concretas CriptoYaProvider, DolarApiProvider y DbCacheProvider; y el contexto CotizacionesService.getDolarQuotes(), que itera el arreglo this.dolarProviders.</w:t>
+      </w:r>
+    </w:p>
+    <w:p>
+      <w:pPr>
+        <w:pStyle w:val="Heading2"/>
+      </w:pPr>
+      <w:r>
+        <w:t>D.2 Estilos Arquitectónicos Identificados</w:t>
+      </w:r>
+    </w:p>
+    <w:p>
+      <w:pPr/>
+      <w:r>
+        <w:t>Como todo sistema real, Zarix no usa un único estilo arquitectónico sino una combinación de varios en distintas partes. A continuación se identifican los ocho estilos presentes y dónde se aplican, siguiendo el apunte de estilos arquitectónicos de la materia.</w:t>
+      </w:r>
+    </w:p>
+    <w:p>
+      <w:pPr/>
+      <w:r>
+        <w:rPr>
+          <w:b/>
+        </w:rPr>
+        <w:t xml:space="preserve">Cliente-Servidor: </w:t>
+      </w:r>
+      <w:r>
+        <w:t>El navegador (PWA) hace requests HTTP/HTTPS a Vercel; el servidor nunca inicia la comunicación.</w:t>
+      </w:r>
+    </w:p>
+    <w:p>
+      <w:pPr/>
+      <w:r>
+        <w:rPr>
+          <w:b/>
+        </w:rPr>
+        <w:t xml:space="preserve">N-Tier: </w:t>
+      </w:r>
+      <w:r>
+        <w:t>Capas separadas: Cliente (PWA) · API (route handlers) · Servicios (lib/services) · Datos (Supabase).</w:t>
+      </w:r>
+    </w:p>
+    <w:p>
+      <w:pPr/>
+      <w:r>
+        <w:rPr>
+          <w:b/>
+        </w:rPr>
+        <w:t xml:space="preserve">Layered (Capas): </w:t>
+      </w:r>
+      <w:r>
+        <w:t>Dentro del backend: rutas → servicios → clientes Supabase; cada capa depende solo de la inferior.</w:t>
+      </w:r>
+    </w:p>
+    <w:p>
+      <w:pPr/>
+      <w:r>
+        <w:rPr>
+          <w:b/>
+        </w:rPr>
+        <w:t xml:space="preserve">Serverless / FaaS: </w:t>
+      </w:r>
+      <w:r>
+        <w:t>Sin servidores propios: funciones serverless y 6 cron jobs ejecutan en Vercel bajo demanda.</w:t>
+      </w:r>
+    </w:p>
+    <w:p>
+      <w:pPr/>
+      <w:r>
+        <w:rPr>
+          <w:b/>
+        </w:rPr>
+        <w:t xml:space="preserve">BaaS (Backend as a Service): </w:t>
+      </w:r>
+      <w:r>
+        <w:t>Supabase provee PostgreSQL, Auth (JWT) y Storage como servicio gestionado.</w:t>
+      </w:r>
+    </w:p>
+    <w:p>
+      <w:pPr/>
+      <w:r>
+        <w:rPr>
+          <w:b/>
+        </w:rPr>
+        <w:t xml:space="preserve">Repository: </w:t>
+      </w:r>
+      <w:r>
+        <w:t>Los *Service encapsulan el acceso a datos vía supabase-js; el resto del código no hace SQL directo.</w:t>
+      </w:r>
+    </w:p>
+    <w:p>
+      <w:pPr/>
+      <w:r>
+        <w:rPr>
+          <w:b/>
+        </w:rPr>
+        <w:t xml:space="preserve">Event-Driven: </w:t>
+      </w:r>
+      <w:r>
+        <w:t>Triggers de BD (update_account_balance), cron jobs programados y webhooks (Telegram, Mercado Pago).</w:t>
+      </w:r>
+    </w:p>
+    <w:p>
+      <w:pPr/>
+      <w:r>
+        <w:rPr>
+          <w:b/>
+        </w:rPr>
+        <w:t xml:space="preserve">Strategy / Adapter: </w:t>
+      </w:r>
+      <w:r>
+        <w:t>Los proveedores de cotización (D.1) normalizan fuentes heterogéneas tras una interfaz común con fallback.</w:t>
+      </w:r>
+    </w:p>
+    <w:p>
+      <w:pPr>
+        <w:jc w:val="center"/>
+      </w:pPr>
+      <w:r>
+        <w:drawing>
+          <wp:inline>
+            <wp:extent cx="5696712" cy="4183523"/>
+            <wp:docPr id="12" name="Picture 12"/>
+            <wp:cNvGraphicFramePr>
+              <a:graphicFrameLocks noChangeAspect="1"/>
+            </wp:cNvGraphicFramePr>
+            <a:graphic>
+              <a:graphicData uri="http://schemas.openxmlformats.org/drawingml/2006/picture">
+                <pic:pic>
+                  <pic:nvPicPr>
+                    <pic:cNvPr id="0" name="fig12_estilos.png"/>
+                    <pic:cNvPicPr/>
+                  </pic:nvPicPr>
+                  <pic:blipFill>
+                    <a:blip r:embed="rId19"/>
+                    <a:stretch>
+                      <a:fillRect/>
+                    </a:stretch>
+                  </pic:blipFill>
+                  <pic:spPr>
+                    <a:xfrm>
+                      <a:off x="0" y="0"/>
+                      <a:ext cx="5696712" cy="4183523"/>
+                    </a:xfrm>
+                    <a:prstGeom prst="rect"/>
+                  </pic:spPr>
+                </pic:pic>
+              </a:graphicData>
+            </a:graphic>
+          </wp:inline>
+        </w:drawing>
+      </w:r>
+    </w:p>
+    <w:p>
+      <w:pPr>
+        <w:jc w:val="center"/>
+      </w:pPr>
+      <w:r>
+        <w:rPr>
+          <w:i/>
+          <w:sz w:val="18"/>
+        </w:rPr>
+        <w:t>Figura 12 – Arquitectura de Zarix con los estilos arquitectónicos identificados.</w:t>
+      </w:r>
+    </w:p>
+    <w:p>
+      <w:pPr/>
+      <w:r>
+        <w:t>Beneficios de esta combinación: extensibilidad (Serverless + Strategy), bajo costo operativo (Serverless + BaaS en free tier), mantenibilidad (Layered + Repository) y reactividad (Event-Driven). Trade-off principal: la dispersión de la lógica entre capas y servicios externos exige disciplina en el filtrado por user_id (la seguridad de datos depende de ello, no solo del RLS).</w:t>
       </w:r>
     </w:p>
     <w:sectPr>

</xml_diff>